<commit_message>
Entry #041: ADR-014 §7 auto-mode amendment; ADR-045 §8.2 home-wide Read grant removed
Co-Authored-By: Claude Opus 5.5 <noreply@anthropic.com>
</commit_message>
<xml_diff>
--- a/ADR_014.docx
+++ b/ADR_014.docx
@@ -44,7 +44,7 @@
           <w:sz w:val="20"/>
           <w:szCs w:val="20"/>
         </w:rPr>
-        <w:t xml:space="preserve">OpenClaw — Phase 1    |    RECONSTRUCTED August 22, 2026    |    Status DECIDED (as of Aug 22, 2026 amendment)</w:t>
+        <w:t xml:space="preserve">OpenClaw — Phase 1    |    RECONSTRUCTED August 22, 2026    |    Status DECIDED (amended Aug 22 and Sep 29, 2026)</w:t>
       </w:r>
     </w:p>
     <w:p>
@@ -230,7 +230,7 @@
                 <w:i w:val="false"/>
                 <w:iCs w:val="false"/>
               </w:rPr>
-              <w:t xml:space="preserve">DECIDED (amended). Originally OPEN from an unconfirmed date (no original document located); moved OPEN → RESOLVED on August 22, 2026 (Entry #021). This reconstruction treats “RESOLVED” as equivalent to “DECIDED” in the house ADR template's vocabulary.</w:t>
+              <w:t xml:space="preserve">DECIDED (amended). Originally OPEN from an unconfirmed date (no original document located); moved OPEN → RESOLVED on August 22, 2026 (Entry #021). Amended September 29, 2026 (Entry #041) to permit Claude Code auto mode under conditions — see Section 7. This reconstruction treats “RESOLVED” as equivalent to “DECIDED” in the house ADR template's vocabulary.</w:t>
             </w:r>
           </w:p>
         </w:tc>
@@ -655,6 +655,20 @@
     </w:p>
     <w:p>
       <w:pPr>
+        <w:spacing w:after="160"/>
+      </w:pPr>
+      <w:r>
+        <w:rPr>
+          <w:b/>
+          <w:bCs/>
+          <w:i w:val="false"/>
+          <w:iCs w:val="false"/>
+        </w:rPr>
+        <w:t xml:space="preserve">⚠ Amended September 29, 2026: the item “Auto mode must never be used” above is superseded by Section 7. The quotation is left verbatim because it is source text; Section 7 governs.</w:t>
+      </w:r>
+    </w:p>
+    <w:p>
+      <w:pPr>
         <w:pStyle w:val="ListParagraph"/>
         <w:numPr>
           <w:ilvl w:val="0"/>
@@ -922,6 +936,181 @@
           <w:iCs w:val="false"/>
         </w:rPr>
         <w:t xml:space="preserve">Fields left blank or marked NOT RECOVERED above are blank because no source material was found — they were not inferred, guessed, or filled from training data or general knowledge of similar documents. This mirrors the sourcing discipline already established for ADR-042.</w:t>
+      </w:r>
+    </w:p>
+    <w:p>
+      <w:pPr>
+        <w:pStyle w:val="Heading1"/>
+        <w:spacing w:after="160" w:before="320"/>
+      </w:pPr>
+      <w:r>
+        <w:rPr>
+          <w:b/>
+          <w:bCs/>
+          <w:sz w:val="28"/>
+          <w:szCs w:val="28"/>
+        </w:rPr>
+        <w:t xml:space="preserve">7.  Amendment — Claude Code Auto Mode (September 29, 2026, Entry #041)</w:t>
+      </w:r>
+    </w:p>
+    <w:p>
+      <w:pPr>
+        <w:spacing w:after="160"/>
+      </w:pPr>
+      <w:r>
+        <w:rPr>
+          <w:b w:val="false"/>
+          <w:bCs w:val="false"/>
+          <w:i w:val="false"/>
+          <w:iCs w:val="false"/>
+        </w:rPr>
+        <w:t xml:space="preserve">Decision: Sheldon Wheeler (operator). Approved in a Claude Code session on September 29, 2026, and written into this document in Manual permission mode with per-action operator approval. Trigger: Entry #040 (September 27, 2026) recorded that the operator had deliberately used Claude Code auto mode, contradicting Section 3. This amendment brings the document into line with that decision rather than treating the practice as a breach.</w:t>
+      </w:r>
+    </w:p>
+    <w:p>
+      <w:pPr>
+        <w:spacing w:after="160"/>
+      </w:pPr>
+      <w:r>
+        <w:rPr>
+          <w:b/>
+          <w:bCs/>
+          <w:i w:val="false"/>
+          <w:iCs w:val="false"/>
+        </w:rPr>
+        <w:t xml:space="preserve">Claude Code auto mode is permitted under all of the following conditions:</w:t>
+      </w:r>
+    </w:p>
+    <w:p>
+      <w:pPr>
+        <w:pStyle w:val="ListParagraph"/>
+        <w:numPr>
+          <w:ilvl w:val="0"/>
+          <w:numId w:val="1"/>
+        </w:numPr>
+        <w:spacing w:after="80"/>
+      </w:pPr>
+      <w:r>
+        <w:t xml:space="preserve">Operator-initiated and operator-present. Auto mode applies only to a Claude Code session the operator starts and attends. It never applies to scheduled, unattended, or agent-initiated execution.</w:t>
+      </w:r>
+    </w:p>
+    <w:p>
+      <w:pPr>
+        <w:pStyle w:val="ListParagraph"/>
+        <w:numPr>
+          <w:ilvl w:val="0"/>
+          <w:numId w:val="1"/>
+        </w:numPr>
+        <w:spacing w:after="80"/>
+      </w:pPr>
+      <w:r>
+        <w:t xml:space="preserve">Core boundary unchanged. No agent, scheduled job, or LLM-driven code path may invoke shell execution autonomously. Auto mode is operator-supervised at the session level rather than per action; it is not autonomous execution.</w:t>
+      </w:r>
+    </w:p>
+    <w:p>
+      <w:pPr>
+        <w:pStyle w:val="ListParagraph"/>
+        <w:numPr>
+          <w:ilvl w:val="0"/>
+          <w:numId w:val="1"/>
+        </w:numPr>
+        <w:spacing w:after="80"/>
+      </w:pPr>
+      <w:r>
+        <w:t xml:space="preserve">Scope unchanged. Execution stays within ~/openclaw. DATA_BOUNDARIES.md §2 applies in full.</w:t>
+      </w:r>
+    </w:p>
+    <w:p>
+      <w:pPr>
+        <w:pStyle w:val="ListParagraph"/>
+        <w:numPr>
+          <w:ilvl w:val="0"/>
+          <w:numId w:val="1"/>
+        </w:numPr>
+        <w:spacing w:after="80"/>
+      </w:pPr>
+      <w:r>
+        <w:t xml:space="preserve">Approve-before-building still applies. New code, ADRs, and migrations are proposed in chat and confirmed by the operator before they are written. Auto mode removes the per-command prompt, not the per-decision approval.</w:t>
+      </w:r>
+    </w:p>
+    <w:p>
+      <w:pPr>
+        <w:pStyle w:val="ListParagraph"/>
+        <w:numPr>
+          <w:ilvl w:val="0"/>
+          <w:numId w:val="1"/>
+        </w:numPr>
+        <w:spacing w:after="80"/>
+      </w:pPr>
+      <w:r>
+        <w:t xml:space="preserve">Outbound limited to designed pipeline behavior — the generator’s self-send SMTP connection and the Federal Register API. No other external sends.</w:t>
+      </w:r>
+    </w:p>
+    <w:p>
+      <w:pPr>
+        <w:pStyle w:val="ListParagraph"/>
+        <w:numPr>
+          <w:ilvl w:val="0"/>
+          <w:numId w:val="1"/>
+        </w:numPr>
+        <w:spacing w:after="80"/>
+      </w:pPr>
+      <w:r>
+        <w:t xml:space="preserve">Cowork remains prohibited.</w:t>
+      </w:r>
+    </w:p>
+    <w:p>
+      <w:pPr>
+        <w:pStyle w:val="ListParagraph"/>
+        <w:numPr>
+          <w:ilvl w:val="0"/>
+          <w:numId w:val="1"/>
+        </w:numPr>
+        <w:spacing w:after="80"/>
+      </w:pPr>
+      <w:r>
+        <w:t xml:space="preserve">Disclosure. Each changelog entry records the permission mode the session ran in.</w:t>
+      </w:r>
+    </w:p>
+    <w:p>
+      <w:pPr>
+        <w:pStyle w:val="ListParagraph"/>
+        <w:numPr>
+          <w:ilvl w:val="0"/>
+          <w:numId w:val="1"/>
+        </w:numPr>
+        <w:spacing w:after="80"/>
+      </w:pPr>
+      <w:r>
+        <w:t xml:space="preserve">Governance edits that change Claude Code’s own permissions (this ADR, the execution-boundary sections of the project instructions and CURRENT_STATE.md, and .claude/settings.local.json where it widens access) are made in Manual mode. The auto-mode classifier refused this very amendment on September 29, 2026 as self-expanding permissions; that refusal is treated as correct behavior, not an obstacle.</w:t>
+      </w:r>
+    </w:p>
+    <w:p>
+      <w:pPr>
+        <w:spacing w:after="160"/>
+      </w:pPr>
+      <w:r>
+        <w:rPr>
+          <w:b w:val="false"/>
+          <w:bCs w:val="false"/>
+          <w:i w:val="false"/>
+          <w:iCs w:val="false"/>
+        </w:rPr>
+        <w:t xml:space="preserve">Compensating technical control (implemented the same day): the home-wide Claude Code allow rule Read(//Users/sheldonwheeler/**) was removed from .claude/settings.local.json under ADR-045 §8.2, leaving only Read(//Users/sheldonwheeler/openclaw/**). Rationale: the August 22 exception relied on per-action approval as its control; auto mode removes that, so pre-authorised reads across the home directory — including all three §2-prohibited paths — would otherwise meet no prompt. This narrows the Read tool only; shell remains unbounded by construction (ADR-045), so the ADR-045 §8.3 traversal-verb hook is still outstanding.</w:t>
+      </w:r>
+    </w:p>
+    <w:p>
+      <w:pPr>
+        <w:spacing w:after="160"/>
+      </w:pPr>
+      <w:r>
+        <w:rPr>
+          <w:b w:val="false"/>
+          <w:bCs w:val="false"/>
+          <w:i/>
+          <w:iCs/>
+        </w:rPr>
+        <w:t xml:space="preserve">NIST control mapping: not assigned. Consistent with Section 6, no mapping is inferred; populate only by explicit operator decision.</w:t>
       </w:r>
     </w:p>
     <w:sectPr>

</xml_diff>